<commit_message>
Align sample fictional markers across text and DOCX
Co-authored-by: applycoding <applycoding@users.noreply.github.com>
</commit_message>
<xml_diff>
--- a/samples/alex-doe-volunteering.docx
+++ b/samples/alex-doe-volunteering.docx
@@ -4,7 +4,7 @@
   <w:body>
     <w:p>
       <w:r>
-        <w:t>FICTIONAL SAMPLE DATA — Alex Doe is not a real person.</w:t>
+        <w:t>FICTIONAL SAMPLE DATA - Alex Doe is not a real person.</w:t>
       </w:r>
     </w:p>
     <w:p>
@@ -12,7 +12,7 @@
         <w:pStyle w:val="Heading1"/>
       </w:pPr>
       <w:r>
-        <w:t>Volunteering — Alex Doe</w:t>
+        <w:t>Volunteering - Alex Doe</w:t>
       </w:r>
     </w:p>
     <w:p>

</xml_diff>